<commit_message>
feat(style): add A1 clinical trial terminology checks
</commit_message>
<xml_diff>
--- a/test_clinical_doc.docx
+++ b/test_clinical_doc.docx
@@ -4,44 +4,143 @@
   <w:body>
     <w:p>
       <w:pPr>
-        <w:pStyle w:val="BodyText"/>
+        <w:rPr>
+          <w:szCs w:val="20"/>
+          <w:lang w:val="en-CA"/>
+        </w:rPr>
       </w:pPr>
       <w:r>
-        <w:t>Test line 1</w:t>
+        <w:rPr>
+          <w:szCs w:val="20"/>
+          <w:lang w:val="en-CA"/>
+        </w:rPr>
+        <w:t>The patient received study drug during the trial.</w:t>
       </w:r>
     </w:p>
     <w:p>
       <w:pPr>
-        <w:pStyle w:val="BodyText"/>
+        <w:rPr>
+          <w:szCs w:val="20"/>
+          <w:lang w:val="en-CA"/>
+        </w:rPr>
+      </w:pPr>
+    </w:p>
+    <w:p>
+      <w:pPr>
+        <w:rPr>
+          <w:szCs w:val="20"/>
+          <w:lang w:val="en-CA"/>
+        </w:rPr>
       </w:pPr>
       <w:r>
-        <w:t>The patient was administered the study drug at 08:00</w:t>
-      </w:r>
-      <w:r>
-        <w:t>.</w:t>
+        <w:rPr>
+          <w:szCs w:val="20"/>
+          <w:lang w:val="en-CA"/>
+        </w:rPr>
+        <w:t>The subjects completed the schedule of events before End of Study.</w:t>
       </w:r>
     </w:p>
     <w:p>
       <w:pPr>
-        <w:pStyle w:val="BodyText"/>
+        <w:rPr>
+          <w:szCs w:val="20"/>
+          <w:lang w:val="en-CA"/>
+        </w:rPr>
+      </w:pPr>
+    </w:p>
+    <w:p>
+      <w:pPr>
+        <w:rPr>
+          <w:szCs w:val="20"/>
+          <w:lang w:val="en-CA"/>
+        </w:rPr>
       </w:pPr>
       <w:r>
-        <w:t>Another test line</w:t>
+        <w:rPr>
+          <w:szCs w:val="20"/>
+          <w:lang w:val="en-CA"/>
+        </w:rPr>
+        <w:t>The healthy volunteers were evaluated for the risk-benefit profile.</w:t>
       </w:r>
     </w:p>
     <w:p>
       <w:pPr>
-        <w:pStyle w:val="BodyText"/>
+        <w:rPr>
+          <w:szCs w:val="20"/>
+          <w:lang w:val="en-CA"/>
+        </w:rPr>
       </w:pPr>
     </w:p>
     <w:p>
       <w:pPr>
-        <w:pStyle w:val="BodyText"/>
+        <w:rPr>
+          <w:szCs w:val="20"/>
+          <w:lang w:val="en-CA"/>
+        </w:rPr>
       </w:pPr>
       <w:r>
-        <w:t>Etc.</w:t>
+        <w:rPr>
+          <w:szCs w:val="20"/>
+          <w:lang w:val="en-CA"/>
+        </w:rPr>
+        <w:t>The C25001 trial enrolled participants at 20 sites.</w:t>
       </w:r>
     </w:p>
+    <w:p>
+      <w:pPr>
+        <w:rPr>
+          <w:szCs w:val="20"/>
+          <w:lang w:val="en-CA"/>
+        </w:rPr>
+      </w:pPr>
+    </w:p>
+    <w:p>
+      <w:pPr>
+        <w:rPr>
+          <w:szCs w:val="20"/>
+          <w:lang w:val="en-CA"/>
+        </w:rPr>
+      </w:pPr>
+      <w:r>
+        <w:rPr>
+          <w:szCs w:val="20"/>
+          <w:lang w:val="en-CA"/>
+        </w:rPr>
+        <w:t>The clinical study report includes the final analysis.</w:t>
+      </w:r>
+    </w:p>
+    <w:p>
+      <w:pPr>
+        <w:rPr>
+          <w:szCs w:val="20"/>
+          <w:lang w:val="en-CA"/>
+        </w:rPr>
+      </w:pPr>
+    </w:p>
+    <w:p>
+      <w:pPr>
+        <w:rPr>
+          <w:szCs w:val="20"/>
+          <w:lang w:val="en-CA"/>
+        </w:rPr>
+      </w:pPr>
+      <w:r>
+        <w:rPr>
+          <w:szCs w:val="20"/>
+          <w:lang w:val="en-CA"/>
+        </w:rPr>
+        <w:t>The patient-reported outcome questionnaire was completed at baseline.</w:t>
+      </w:r>
+    </w:p>
+    <w:p>
+      <w:pPr>
+        <w:rPr>
+          <w:szCs w:val="20"/>
+          <w:lang w:val="en-CA"/>
+        </w:rPr>
+      </w:pPr>
+    </w:p>
+    <w:p/>
     <w:sectPr>
       <w:footnotePr>
         <w:numRestart w:val="eachSect"/>
@@ -1672,7 +1771,6 @@
   <w:style w:type="character" w:default="1" w:styleId="DefaultParagraphFont">
     <w:name w:val="Default Paragraph Font"/>
     <w:uiPriority w:val="1"/>
-    <w:semiHidden/>
     <w:unhideWhenUsed/>
   </w:style>
   <w:style w:type="table" w:default="1" w:styleId="TableNormal">
@@ -3019,15 +3117,6 @@
 </file>
 
 <file path=customXml/item1.xml><?xml version="1.0" encoding="utf-8"?>
-<?mso-contentType ?>
-<FormTemplates xmlns="http://schemas.microsoft.com/sharepoint/v3/contenttype/forms">
-  <Display>DocumentLibraryForm</Display>
-  <Edit>DocumentLibraryForm</Edit>
-  <New>DocumentLibraryForm</New>
-</FormTemplates>
-</file>
-
-<file path=customXml/item2.xml><?xml version="1.0" encoding="utf-8"?>
 <ct:contentTypeSchema xmlns:ct="http://schemas.microsoft.com/office/2006/metadata/contentType" xmlns:ma="http://schemas.microsoft.com/office/2006/metadata/properties/metaAttributes" ct:_="" ma:_="" ma:contentTypeName="Document" ma:contentTypeID="0x010100CCF3AE90328B76438C7E402C39B7E829" ma:contentTypeVersion="8" ma:contentTypeDescription="Create a new document." ma:contentTypeScope="" ma:versionID="e8193817f1d9c01fda3be6e9a19335a1">
   <xsd:schema xmlns:xsd="http://www.w3.org/2001/XMLSchema" xmlns:xs="http://www.w3.org/2001/XMLSchema" xmlns:p="http://schemas.microsoft.com/office/2006/metadata/properties" xmlns:ns2="7a841538-5efc-47d0-818e-520c9ee985b8" xmlns:ns3="c12657b8-67cc-4ae4-af65-790693d86c52" targetNamespace="http://schemas.microsoft.com/office/2006/metadata/properties" ma:root="true" ma:fieldsID="b1c015c9dbada3bde2c62e35b0db89e4" ns2:_="" ns3:_="">
     <xsd:import namespace="7a841538-5efc-47d0-818e-520c9ee985b8"/>
@@ -3198,25 +3287,26 @@
 </ct:contentTypeSchema>
 </file>
 
-<file path=customXml/item3.xml><?xml version="1.0" encoding="utf-8"?>
-<b:Sources xmlns:b="http://schemas.openxmlformats.org/officeDocument/2006/bibliography" xmlns="http://schemas.openxmlformats.org/officeDocument/2006/bibliography" SelectedStyle="\APA.XSL" StyleName="APA Fifth Edition"/>
+<file path=customXml/item2.xml><?xml version="1.0" encoding="utf-8"?>
+<?mso-contentType ?>
+<FormTemplates xmlns="http://schemas.microsoft.com/sharepoint/v3/contenttype/forms">
+  <Display>DocumentLibraryForm</Display>
+  <Edit>DocumentLibraryForm</Edit>
+  <New>DocumentLibraryForm</New>
+</FormTemplates>
 </file>
 
-<file path=customXml/item4.xml><?xml version="1.0" encoding="utf-8"?>
+<file path=customXml/item3.xml><?xml version="1.0" encoding="utf-8"?>
 <p:properties xmlns:p="http://schemas.microsoft.com/office/2006/metadata/properties" xmlns:xsi="http://www.w3.org/2001/XMLSchema-instance" xmlns:pc="http://schemas.microsoft.com/office/infopath/2007/PartnerControls">
   <documentManagement/>
 </p:properties>
 </file>
 
-<file path=customXml/itemProps1.xml><?xml version="1.0" encoding="utf-8"?>
-<ds:datastoreItem xmlns:ds="http://schemas.openxmlformats.org/officeDocument/2006/customXml" ds:itemID="{1E4C6BF7-8445-4565-B36B-99F291A6A30F}">
-  <ds:schemaRefs>
-    <ds:schemaRef ds:uri="http://schemas.microsoft.com/sharepoint/v3/contenttype/forms"/>
-  </ds:schemaRefs>
-</ds:datastoreItem>
+<file path=customXml/item4.xml><?xml version="1.0" encoding="utf-8"?>
+<b:Sources xmlns:b="http://schemas.openxmlformats.org/officeDocument/2006/bibliography" xmlns="http://schemas.openxmlformats.org/officeDocument/2006/bibliography" SelectedStyle="\APA.XSL" StyleName="APA Fifth Edition"/>
 </file>
 
-<file path=customXml/itemProps2.xml><?xml version="1.0" encoding="utf-8"?>
+<file path=customXml/itemProps1.xml><?xml version="1.0" encoding="utf-8"?>
 <ds:datastoreItem xmlns:ds="http://schemas.openxmlformats.org/officeDocument/2006/customXml" ds:itemID="{6B87EED3-0F78-4974-AE45-1391F1027B08}">
   <ds:schemaRefs>
     <ds:schemaRef ds:uri="http://schemas.microsoft.com/office/2006/metadata/contentType"/>
@@ -3235,19 +3325,27 @@
 </ds:datastoreItem>
 </file>
 
-<file path=customXml/itemProps3.xml><?xml version="1.0" encoding="utf-8"?>
-<ds:datastoreItem xmlns:ds="http://schemas.openxmlformats.org/officeDocument/2006/customXml" ds:itemID="{ADC4D893-4DFB-49D2-819D-D73D477748ED}">
+<file path=customXml/itemProps2.xml><?xml version="1.0" encoding="utf-8"?>
+<ds:datastoreItem xmlns:ds="http://schemas.openxmlformats.org/officeDocument/2006/customXml" ds:itemID="{1E4C6BF7-8445-4565-B36B-99F291A6A30F}">
   <ds:schemaRefs>
-    <ds:schemaRef ds:uri="http://schemas.openxmlformats.org/officeDocument/2006/bibliography"/>
+    <ds:schemaRef ds:uri="http://schemas.microsoft.com/sharepoint/v3/contenttype/forms"/>
   </ds:schemaRefs>
 </ds:datastoreItem>
 </file>
 
-<file path=customXml/itemProps4.xml><?xml version="1.0" encoding="utf-8"?>
+<file path=customXml/itemProps3.xml><?xml version="1.0" encoding="utf-8"?>
 <ds:datastoreItem xmlns:ds="http://schemas.openxmlformats.org/officeDocument/2006/customXml" ds:itemID="{F902E377-FED0-461B-9F36-B566A79AC69D}">
   <ds:schemaRefs>
     <ds:schemaRef ds:uri="http://schemas.microsoft.com/office/2006/metadata/properties"/>
     <ds:schemaRef ds:uri="http://schemas.microsoft.com/office/infopath/2007/PartnerControls"/>
   </ds:schemaRefs>
 </ds:datastoreItem>
+</file>
+
+<file path=customXml/itemProps4.xml><?xml version="1.0" encoding="utf-8"?>
+<ds:datastoreItem xmlns:ds="http://schemas.openxmlformats.org/officeDocument/2006/customXml" ds:itemID="{ADC4D893-4DFB-49D2-819D-D73D477748ED}">
+  <ds:schemaRefs>
+    <ds:schemaRef ds:uri="http://schemas.openxmlformats.org/officeDocument/2006/bibliography"/>
+  </ds:schemaRefs>
+</ds:datastoreItem>
 </file>
</xml_diff>